<commit_message>
docs: refine IT-036-001 implementability criteria
</commit_message>
<xml_diff>
--- a/docs/IT-036-001 — Operational Submission MVP.docx
+++ b/docs/IT-036-001 — Operational Submission MVP.docx
@@ -17224,25 +17224,35 @@
       <w:bookmarkEnd w:id="108"/>
       <w:r>
         <w:rPr>
-          <w:b w:val="1"/>
-          <w:bCs w:val="1"/>
-          <w:sz w:val="34"/>
-          <w:szCs w:val="34"/>
-          <w:rtl w:val="0"/>
-        </w:rPr>
-        <w:t xml:space="preserve">CA-036-004 — Una única invocación contractual de presentación</w:t>
-      </w:r>
-    </w:p>
-    <w:p>
-      <w:pPr>
-        <w:spacing w:after="240" w:before="240" w:lineRule="auto"/>
-        <w:rPr/>
-      </w:pPr>
-      <w:r>
-        <w:rPr>
-          <w:rtl w:val="0"/>
-        </w:rPr>
-        <w:t xml:space="preserve">Para una ejecución válida de </w:t>
+          <w:rtl w:val="0"/>
+        </w:rPr>
+      </w:r>
+    </w:p>
+    <w:p>
+      <w:pPr>
+        <w:pStyle w:val="Heading2"/>
+        <w:spacing w:after="240" w:before="240" w:lineRule="auto"/>
+        <w:rPr/>
+      </w:pPr>
+      <w:bookmarkStart w:colFirst="0" w:colLast="0" w:name="_7i688ujlsmh9" w:id="109"/>
+      <w:bookmarkEnd w:id="109"/>
+      <w:r>
+        <w:rPr>
+          <w:rtl w:val="0"/>
+        </w:rPr>
+        <w:t xml:space="preserve">CA-036-004 — Correspondencia de presentación</w:t>
+      </w:r>
+    </w:p>
+    <w:p>
+      <w:pPr>
+        <w:spacing w:after="240" w:before="240" w:lineRule="auto"/>
+        <w:rPr/>
+      </w:pPr>
+      <w:r>
+        <w:rPr>
+          <w:rtl w:val="0"/>
+        </w:rPr>
+        <w:t xml:space="preserve">Cada ejecución exitosa de </w:t>
       </w:r>
       <w:r>
         <w:rPr>
@@ -17256,7 +17266,7 @@
         <w:rPr>
           <w:rtl w:val="0"/>
         </w:rPr>
-        <w:t xml:space="preserve">, la responsabilidad deberá solicitar la presentación del </w:t>
+        <w:t xml:space="preserve"> deberá corresponder a la presentación del </w:t>
       </w:r>
       <w:r>
         <w:rPr>
@@ -17270,19 +17280,7 @@
         <w:rPr>
           <w:rtl w:val="0"/>
         </w:rPr>
-        <w:t xml:space="preserve"> correspondiente mediante la frontera autorizada.</w:t>
-      </w:r>
-    </w:p>
-    <w:p>
-      <w:pPr>
-        <w:spacing w:after="240" w:before="240" w:lineRule="auto"/>
-        <w:rPr/>
-      </w:pPr>
-      <w:r>
-        <w:rPr>
-          <w:rtl w:val="0"/>
-        </w:rPr>
-        <w:t xml:space="preserve">El IT no prescribe cómo instrumentar internamente esta colaboración, solo que la responsabilidad observable se cumpla una vez por cada intento de </w:t>
+        <w:t xml:space="preserve"> recibido y producir un único </w:t>
       </w:r>
       <w:r>
         <w:rPr>
@@ -17290,13 +17288,36 @@
           <w:color w:val="188038"/>
           <w:rtl w:val="0"/>
         </w:rPr>
-        <w:t xml:space="preserve">submit</w:t>
-      </w:r>
-      <w:r>
-        <w:rPr>
-          <w:rtl w:val="0"/>
-        </w:rPr>
-        <w:t xml:space="preserve">.</w:t>
+        <w:t xml:space="preserve">OperationalSubmission</w:t>
+      </w:r>
+      <w:r>
+        <w:rPr>
+          <w:rtl w:val="0"/>
+        </w:rPr>
+        <w:t xml:space="preserve"> asociado a dicha solicitud.</w:t>
+      </w:r>
+    </w:p>
+    <w:p>
+      <w:pPr>
+        <w:spacing w:after="240" w:before="240" w:lineRule="auto"/>
+        <w:rPr/>
+      </w:pPr>
+      <w:r>
+        <w:rPr>
+          <w:rtl w:val="0"/>
+        </w:rPr>
+        <w:t xml:space="preserve">El IT no prescribe el número ni la organización de las interacciones internas necesarias para satisfacer esta propiedad.</w:t>
+      </w:r>
+    </w:p>
+    <w:p>
+      <w:pPr>
+        <w:spacing w:after="240" w:before="240" w:lineRule="auto"/>
+        <w:rPr/>
+      </w:pPr>
+      <w:r>
+        <w:rPr>
+          <w:rtl w:val="0"/>
+        </w:rPr>
       </w:r>
     </w:p>
     <w:p>
@@ -17327,8 +17348,8 @@
           <w:szCs w:val="34"/>
         </w:rPr>
       </w:pPr>
-      <w:bookmarkStart w:colFirst="0" w:colLast="0" w:name="_i9xyfdyn65cm" w:id="109"/>
-      <w:bookmarkEnd w:id="109"/>
+      <w:bookmarkStart w:colFirst="0" w:colLast="0" w:name="_i9xyfdyn65cm" w:id="110"/>
+      <w:bookmarkEnd w:id="110"/>
       <w:r>
         <w:rPr>
           <w:b w:val="1"/>
@@ -17448,8 +17469,8 @@
           <w:szCs w:val="34"/>
         </w:rPr>
       </w:pPr>
-      <w:bookmarkStart w:colFirst="0" w:colLast="0" w:name="_4btl7ac82iie" w:id="110"/>
-      <w:bookmarkEnd w:id="110"/>
+      <w:bookmarkStart w:colFirst="0" w:colLast="0" w:name="_4btl7ac82iie" w:id="111"/>
+      <w:bookmarkEnd w:id="111"/>
       <w:r>
         <w:rPr>
           <w:b w:val="1"/>
@@ -17565,8 +17586,8 @@
           <w:szCs w:val="34"/>
         </w:rPr>
       </w:pPr>
-      <w:bookmarkStart w:colFirst="0" w:colLast="0" w:name="_2vh19fmfjxqi" w:id="111"/>
-      <w:bookmarkEnd w:id="111"/>
+      <w:bookmarkStart w:colFirst="0" w:colLast="0" w:name="_2vh19fmfjxqi" w:id="112"/>
+      <w:bookmarkEnd w:id="112"/>
       <w:r>
         <w:rPr>
           <w:b w:val="1"/>
@@ -17698,8 +17719,8 @@
           <w:szCs w:val="34"/>
         </w:rPr>
       </w:pPr>
-      <w:bookmarkStart w:colFirst="0" w:colLast="0" w:name="_hhhdqy7npgus" w:id="112"/>
-      <w:bookmarkEnd w:id="112"/>
+      <w:bookmarkStart w:colFirst="0" w:colLast="0" w:name="_hhhdqy7npgus" w:id="113"/>
+      <w:bookmarkEnd w:id="113"/>
       <w:r>
         <w:rPr>
           <w:b w:val="1"/>
@@ -17763,8 +17784,8 @@
           <w:szCs w:val="34"/>
         </w:rPr>
       </w:pPr>
-      <w:bookmarkStart w:colFirst="0" w:colLast="0" w:name="_f1s777dtlg73" w:id="113"/>
-      <w:bookmarkEnd w:id="113"/>
+      <w:bookmarkStart w:colFirst="0" w:colLast="0" w:name="_f1s777dtlg73" w:id="114"/>
+      <w:bookmarkEnd w:id="114"/>
       <w:r>
         <w:rPr>
           <w:b w:val="1"/>
@@ -17844,8 +17865,8 @@
           <w:szCs w:val="34"/>
         </w:rPr>
       </w:pPr>
-      <w:bookmarkStart w:colFirst="0" w:colLast="0" w:name="_6uwwo27mwrr5" w:id="114"/>
-      <w:bookmarkEnd w:id="114"/>
+      <w:bookmarkStart w:colFirst="0" w:colLast="0" w:name="_6uwwo27mwrr5" w:id="115"/>
+      <w:bookmarkEnd w:id="115"/>
       <w:r>
         <w:rPr>
           <w:b w:val="1"/>
@@ -17925,8 +17946,8 @@
           <w:szCs w:val="34"/>
         </w:rPr>
       </w:pPr>
-      <w:bookmarkStart w:colFirst="0" w:colLast="0" w:name="_7g2ctp7qxilx" w:id="115"/>
-      <w:bookmarkEnd w:id="115"/>
+      <w:bookmarkStart w:colFirst="0" w:colLast="0" w:name="_7g2ctp7qxilx" w:id="116"/>
+      <w:bookmarkEnd w:id="116"/>
       <w:r>
         <w:rPr>
           <w:b w:val="1"/>
@@ -17978,8 +17999,8 @@
           <w:szCs w:val="34"/>
         </w:rPr>
       </w:pPr>
-      <w:bookmarkStart w:colFirst="0" w:colLast="0" w:name="_aentwgeveggw" w:id="116"/>
-      <w:bookmarkEnd w:id="116"/>
+      <w:bookmarkStart w:colFirst="0" w:colLast="0" w:name="_aentwgeveggw" w:id="117"/>
+      <w:bookmarkEnd w:id="117"/>
       <w:r>
         <w:rPr>
           <w:b w:val="1"/>
@@ -18123,8 +18144,8 @@
           <w:szCs w:val="46"/>
         </w:rPr>
       </w:pPr>
-      <w:bookmarkStart w:colFirst="0" w:colLast="0" w:name="_m9ii0e29b4tp" w:id="117"/>
-      <w:bookmarkEnd w:id="117"/>
+      <w:bookmarkStart w:colFirst="0" w:colLast="0" w:name="_m9ii0e29b4tp" w:id="118"/>
+      <w:bookmarkEnd w:id="118"/>
       <w:r>
         <w:rPr>
           <w:b w:val="1"/>
@@ -18188,8 +18209,8 @@
           <w:szCs w:val="34"/>
         </w:rPr>
       </w:pPr>
-      <w:bookmarkStart w:colFirst="0" w:colLast="0" w:name="_3o9zwzhs242d" w:id="118"/>
-      <w:bookmarkEnd w:id="118"/>
+      <w:bookmarkStart w:colFirst="0" w:colLast="0" w:name="_3o9zwzhs242d" w:id="119"/>
+      <w:bookmarkEnd w:id="119"/>
       <w:r>
         <w:rPr>
           <w:b w:val="1"/>
@@ -18387,8 +18408,8 @@
           <w:szCs w:val="34"/>
         </w:rPr>
       </w:pPr>
-      <w:bookmarkStart w:colFirst="0" w:colLast="0" w:name="_k24bwh43myf7" w:id="119"/>
-      <w:bookmarkEnd w:id="119"/>
+      <w:bookmarkStart w:colFirst="0" w:colLast="0" w:name="_k24bwh43myf7" w:id="120"/>
+      <w:bookmarkEnd w:id="120"/>
       <w:r>
         <w:rPr>
           <w:b w:val="1"/>
@@ -18558,8 +18579,8 @@
           <w:szCs w:val="34"/>
         </w:rPr>
       </w:pPr>
-      <w:bookmarkStart w:colFirst="0" w:colLast="0" w:name="_tqn5h65a9h4b" w:id="120"/>
-      <w:bookmarkEnd w:id="120"/>
+      <w:bookmarkStart w:colFirst="0" w:colLast="0" w:name="_tqn5h65a9h4b" w:id="121"/>
+      <w:bookmarkEnd w:id="121"/>
       <w:r>
         <w:rPr>
           <w:b w:val="1"/>
@@ -18637,8 +18658,8 @@
           <w:szCs w:val="34"/>
         </w:rPr>
       </w:pPr>
-      <w:bookmarkStart w:colFirst="0" w:colLast="0" w:name="_yyz7dkd8uubq" w:id="121"/>
-      <w:bookmarkEnd w:id="121"/>
+      <w:bookmarkStart w:colFirst="0" w:colLast="0" w:name="_yyz7dkd8uubq" w:id="122"/>
+      <w:bookmarkEnd w:id="122"/>
       <w:r>
         <w:rPr>
           <w:b w:val="1"/>
@@ -18770,8 +18791,8 @@
           <w:szCs w:val="34"/>
         </w:rPr>
       </w:pPr>
-      <w:bookmarkStart w:colFirst="0" w:colLast="0" w:name="_kzs0ryymz5h3" w:id="122"/>
-      <w:bookmarkEnd w:id="122"/>
+      <w:bookmarkStart w:colFirst="0" w:colLast="0" w:name="_kzs0ryymz5h3" w:id="123"/>
+      <w:bookmarkEnd w:id="123"/>
       <w:r>
         <w:rPr>
           <w:b w:val="1"/>
@@ -18915,8 +18936,8 @@
           <w:szCs w:val="34"/>
         </w:rPr>
       </w:pPr>
-      <w:bookmarkStart w:colFirst="0" w:colLast="0" w:name="_3eh0e4zdw0m3" w:id="123"/>
-      <w:bookmarkEnd w:id="123"/>
+      <w:bookmarkStart w:colFirst="0" w:colLast="0" w:name="_3eh0e4zdw0m3" w:id="124"/>
+      <w:bookmarkEnd w:id="124"/>
       <w:r>
         <w:rPr>
           <w:b w:val="1"/>
@@ -18994,8 +19015,8 @@
           <w:szCs w:val="34"/>
         </w:rPr>
       </w:pPr>
-      <w:bookmarkStart w:colFirst="0" w:colLast="0" w:name="_v8e86snvegcr" w:id="124"/>
-      <w:bookmarkEnd w:id="124"/>
+      <w:bookmarkStart w:colFirst="0" w:colLast="0" w:name="_v8e86snvegcr" w:id="125"/>
+      <w:bookmarkEnd w:id="125"/>
       <w:r>
         <w:rPr>
           <w:b w:val="1"/>
@@ -19157,8 +19178,8 @@
           <w:szCs w:val="46"/>
         </w:rPr>
       </w:pPr>
-      <w:bookmarkStart w:colFirst="0" w:colLast="0" w:name="_uspycueoicvj" w:id="125"/>
-      <w:bookmarkEnd w:id="125"/>
+      <w:bookmarkStart w:colFirst="0" w:colLast="0" w:name="_uspycueoicvj" w:id="126"/>
+      <w:bookmarkEnd w:id="126"/>
       <w:r>
         <w:rPr>
           <w:b w:val="1"/>
@@ -19496,8 +19517,8 @@
           <w:szCs w:val="46"/>
         </w:rPr>
       </w:pPr>
-      <w:bookmarkStart w:colFirst="0" w:colLast="0" w:name="_xg5cxzqb4ofw" w:id="126"/>
-      <w:bookmarkEnd w:id="126"/>
+      <w:bookmarkStart w:colFirst="0" w:colLast="0" w:name="_xg5cxzqb4ofw" w:id="127"/>
+      <w:bookmarkEnd w:id="127"/>
       <w:r>
         <w:rPr>
           <w:b w:val="1"/>
@@ -19689,8 +19710,8 @@
           <w:szCs w:val="46"/>
         </w:rPr>
       </w:pPr>
-      <w:bookmarkStart w:colFirst="0" w:colLast="0" w:name="_x3joy2p7aoh7" w:id="127"/>
-      <w:bookmarkEnd w:id="127"/>
+      <w:bookmarkStart w:colFirst="0" w:colLast="0" w:name="_x3joy2p7aoh7" w:id="128"/>
+      <w:bookmarkEnd w:id="128"/>
       <w:r>
         <w:rPr>
           <w:b w:val="1"/>
@@ -20070,8 +20091,8 @@
           <w:szCs w:val="46"/>
         </w:rPr>
       </w:pPr>
-      <w:bookmarkStart w:colFirst="0" w:colLast="0" w:name="_yx3be0wdcsvt" w:id="128"/>
-      <w:bookmarkEnd w:id="128"/>
+      <w:bookmarkStart w:colFirst="0" w:colLast="0" w:name="_yx3be0wdcsvt" w:id="129"/>
+      <w:bookmarkEnd w:id="129"/>
       <w:r>
         <w:rPr>
           <w:b w:val="1"/>
@@ -20295,8 +20316,8 @@
           <w:szCs w:val="46"/>
         </w:rPr>
       </w:pPr>
-      <w:bookmarkStart w:colFirst="0" w:colLast="0" w:name="_l9hsa6w9spep" w:id="129"/>
-      <w:bookmarkEnd w:id="129"/>
+      <w:bookmarkStart w:colFirst="0" w:colLast="0" w:name="_l9hsa6w9spep" w:id="130"/>
+      <w:bookmarkEnd w:id="130"/>
       <w:r>
         <w:rPr>
           <w:b w:val="1"/>
@@ -20706,8 +20727,8 @@
           <w:szCs w:val="46"/>
         </w:rPr>
       </w:pPr>
-      <w:bookmarkStart w:colFirst="0" w:colLast="0" w:name="_jvyziij77qxu" w:id="130"/>
-      <w:bookmarkEnd w:id="130"/>
+      <w:bookmarkStart w:colFirst="0" w:colLast="0" w:name="_jvyziij77qxu" w:id="131"/>
+      <w:bookmarkEnd w:id="131"/>
       <w:r>
         <w:rPr>
           <w:b w:val="1"/>
@@ -20837,8 +20858,8 @@
           <w:szCs w:val="46"/>
         </w:rPr>
       </w:pPr>
-      <w:bookmarkStart w:colFirst="0" w:colLast="0" w:name="_tujk31z9jch1" w:id="131"/>
-      <w:bookmarkEnd w:id="131"/>
+      <w:bookmarkStart w:colFirst="0" w:colLast="0" w:name="_tujk31z9jch1" w:id="132"/>
+      <w:bookmarkEnd w:id="132"/>
       <w:r>
         <w:rPr>
           <w:b w:val="1"/>

</xml_diff>